<commit_message>
closes #145 : added phases transverses to etudes and quick edit of CE doctype. Fix nbPhases issue in doc generation
</commit_message>
<xml_diff>
--- a/flower_backend/doctypes/CE.docx
+++ b/flower_backend/doctypes/CE.docx
@@ -449,7 +449,7 @@
           <w:sz w:val="20"/>
           <w:szCs w:val="20"/>
         </w:rPr>
-        <w:t>représentée par son {{etude.docEtude.signer2.position}} {% if etude.docEtude.signer2.gender%}sa{%else%}son{%endif%} {{ etude.docEtude.signer2.position  }} {% if etude.docEtude.signer2.gender%}Mme{%else%}M. {%endif%} {{ etude.docEtude.signer2.firstname }} {{ etude.docEtude.signer2.lastname }}</w:t>
+        <w:t>représentée par son {{etude.docEtude.signer2.position}} {% if etude.docEtude.signer2.gender%}a{%else%}son{%endif%} {{ etude.docEtude.signer2.position  }} {% if etude.docEtude.signer2.gender%}Mme{%else%}M. {%endif%} {{ etude.docEtude.signer2.firstname }} {{ etude.docEtude.signer2.lastname }}</w:t>
       </w:r>
     </w:p>
     <w:p>
@@ -2643,10 +2643,29 @@
       <w:r>
         <w:rPr>
           <w:rFonts w:eastAsia="Montserrat" w:cs="Montserrat" w:ascii="Montserrat" w:hAnsi="Montserrat"/>
+          <w:b w:val="false"/>
+          <w:bCs w:val="false"/>
+          <w:color w:val="auto"/>
+          <w:kern w:val="0"/>
+          <w:sz w:val="20"/>
+          <w:szCs w:val="20"/>
+          <w:lang w:val="fr-FR" w:eastAsia="zh-CN" w:bidi="hi-IN"/>
+        </w:rPr>
+        <w:t>{% for phase in etude.phaseEtude.all()|phasesReal() %}</w:t>
+      </w:r>
+    </w:p>
+    <w:p>
+      <w:pPr>
+        <w:pStyle w:val="Heading3"/>
+        <w:rPr/>
+      </w:pPr>
+      <w:r>
+        <w:rPr>
+          <w:rFonts w:eastAsia="Montserrat" w:cs="Montserrat" w:ascii="Montserrat" w:hAnsi="Montserrat"/>
           <w:sz w:val="28"/>
           <w:szCs w:val="28"/>
         </w:rPr>
-        <w:t xml:space="preserve">{% for phase in etude.phaseEtude.all() %}Phase {{phase.index}}: </w:t>
+        <w:t xml:space="preserve">Phase {{phase.index}}: </w:t>
       </w:r>
       <w:r>
         <w:rPr>
@@ -2674,38 +2693,6 @@
         </w:rPr>
         <w:t>.</w:t>
       </w:r>
-    </w:p>
-    <w:p>
-      <w:pPr>
-        <w:pStyle w:val="normal1"/>
-        <w:spacing w:lineRule="auto" w:line="240" w:before="0" w:after="0"/>
-        <w:ind w:hanging="0"/>
-        <w:rPr>
-          <w:rFonts w:ascii="Montserrat" w:hAnsi="Montserrat" w:eastAsia="Montserrat" w:cs="Montserrat"/>
-          <w:sz w:val="20"/>
-          <w:szCs w:val="20"/>
-        </w:rPr>
-      </w:pPr>
-      <w:r>
-        <w:rPr>
-          <w:rFonts w:eastAsia="Montserrat" w:cs="Montserrat" w:ascii="Montserrat" w:hAnsi="Montserrat"/>
-          <w:sz w:val="20"/>
-          <w:szCs w:val="20"/>
-        </w:rPr>
-      </w:r>
-    </w:p>
-    <w:p>
-      <w:pPr>
-        <w:pStyle w:val="normal1"/>
-        <w:spacing w:lineRule="auto" w:line="240" w:before="0" w:after="0"/>
-        <w:ind w:hanging="0"/>
-        <w:jc w:val="center"/>
-        <w:rPr>
-          <w:rFonts w:ascii="Montserrat" w:hAnsi="Montserrat" w:eastAsia="Montserrat" w:cs="Montserrat"/>
-          <w:sz w:val="20"/>
-          <w:szCs w:val="20"/>
-        </w:rPr>
-      </w:pPr>
       <w:r>
         <w:rPr>
           <w:rFonts w:eastAsia="Montserrat" w:cs="Montserrat" w:ascii="Montserrat" w:hAnsi="Montserrat"/>
@@ -2935,6 +2922,373 @@
     <w:p>
       <w:pPr>
         <w:pStyle w:val="normal1"/>
+        <w:widowControl w:val="false"/>
+        <w:spacing w:lineRule="auto" w:line="276" w:before="0" w:after="0"/>
+        <w:ind w:hanging="0"/>
+        <w:rPr>
+          <w:rFonts w:ascii="Montserrat" w:hAnsi="Montserrat" w:eastAsia="Montserrat" w:cs="Montserrat"/>
+          <w:sz w:val="20"/>
+          <w:szCs w:val="20"/>
+        </w:rPr>
+      </w:pPr>
+      <w:r>
+        <w:rPr/>
+      </w:r>
+    </w:p>
+    <w:p>
+      <w:pPr>
+        <w:pStyle w:val="Heading3"/>
+        <w:widowControl w:val="false"/>
+        <w:spacing w:lineRule="auto" w:line="276" w:before="0" w:after="0"/>
+        <w:ind w:hanging="0"/>
+        <w:rPr>
+          <w:rFonts w:ascii="Montserrat" w:hAnsi="Montserrat" w:eastAsia="Montserrat" w:cs="Montserrat"/>
+          <w:sz w:val="20"/>
+          <w:szCs w:val="20"/>
+        </w:rPr>
+      </w:pPr>
+      <w:bookmarkStart w:id="12" w:name="_heading=h.css0r0xowr1l_Copy_1"/>
+      <w:bookmarkEnd w:id="12"/>
+      <w:r>
+        <w:rPr>
+          <w:rFonts w:eastAsia="Montserrat" w:cs="Montserrat" w:ascii="Montserrat" w:hAnsi="Montserrat"/>
+          <w:b w:val="false"/>
+          <w:bCs w:val="false"/>
+          <w:color w:val="auto"/>
+          <w:kern w:val="0"/>
+          <w:sz w:val="20"/>
+          <w:szCs w:val="20"/>
+          <w:lang w:val="fr-FR" w:eastAsia="zh-CN" w:bidi="hi-IN"/>
+        </w:rPr>
+        <w:t>{% for phase in etude.phaseEtude.all()|phases</w:t>
+      </w:r>
+      <w:r>
+        <w:rPr>
+          <w:rFonts w:eastAsia="Montserrat" w:cs="Montserrat" w:ascii="Montserrat" w:hAnsi="Montserrat"/>
+          <w:b w:val="false"/>
+          <w:bCs w:val="false"/>
+          <w:color w:val="auto"/>
+          <w:kern w:val="0"/>
+          <w:sz w:val="20"/>
+          <w:szCs w:val="20"/>
+          <w:lang w:val="fr-FR" w:eastAsia="zh-CN" w:bidi="hi-IN"/>
+        </w:rPr>
+        <w:t>Transverse</w:t>
+      </w:r>
+      <w:r>
+        <w:rPr>
+          <w:rFonts w:eastAsia="Montserrat" w:cs="Montserrat" w:ascii="Montserrat" w:hAnsi="Montserrat"/>
+          <w:b w:val="false"/>
+          <w:bCs w:val="false"/>
+          <w:color w:val="auto"/>
+          <w:kern w:val="0"/>
+          <w:sz w:val="20"/>
+          <w:szCs w:val="20"/>
+          <w:lang w:val="fr-FR" w:eastAsia="zh-CN" w:bidi="hi-IN"/>
+        </w:rPr>
+        <w:t>() %}</w:t>
+      </w:r>
+    </w:p>
+    <w:p>
+      <w:pPr>
+        <w:pStyle w:val="Heading3"/>
+        <w:rPr/>
+      </w:pPr>
+      <w:r>
+        <w:rPr>
+          <w:rFonts w:eastAsia="Montserrat" w:cs="Montserrat" w:ascii="Montserrat" w:hAnsi="Montserrat"/>
+          <w:sz w:val="28"/>
+          <w:szCs w:val="28"/>
+        </w:rPr>
+        <w:t xml:space="preserve">Phase </w:t>
+      </w:r>
+      <w:r>
+        <w:rPr>
+          <w:rFonts w:eastAsia="Montserrat" w:cs="Montserrat" w:ascii="Montserrat" w:hAnsi="Montserrat"/>
+          <w:sz w:val="28"/>
+          <w:szCs w:val="28"/>
+        </w:rPr>
+        <w:t>transverse</w:t>
+      </w:r>
+      <w:r>
+        <w:rPr>
+          <w:rFonts w:eastAsia="Montserrat" w:cs="Montserrat" w:ascii="Montserrat" w:hAnsi="Montserrat"/>
+          <w:sz w:val="28"/>
+          <w:szCs w:val="28"/>
+        </w:rPr>
+        <w:t xml:space="preserve"> {{phase.index</w:t>
+      </w:r>
+      <w:r>
+        <w:rPr>
+          <w:rFonts w:eastAsia="Montserrat" w:cs="Montserrat" w:ascii="Montserrat" w:hAnsi="Montserrat"/>
+          <w:sz w:val="28"/>
+          <w:szCs w:val="28"/>
+        </w:rPr>
+        <w:t>|abs</w:t>
+      </w:r>
+      <w:r>
+        <w:rPr>
+          <w:rFonts w:eastAsia="Montserrat" w:cs="Montserrat" w:ascii="Montserrat" w:hAnsi="Montserrat"/>
+          <w:sz w:val="28"/>
+          <w:szCs w:val="28"/>
+        </w:rPr>
+        <w:t xml:space="preserve">}}: </w:t>
+      </w:r>
+      <w:r>
+        <w:rPr>
+          <w:rFonts w:eastAsia="Montserrat" w:cs="Montserrat" w:ascii="Montserrat" w:hAnsi="Montserrat"/>
+          <w:b w:val="false"/>
+          <w:sz w:val="28"/>
+          <w:szCs w:val="28"/>
+        </w:rPr>
+        <w:t xml:space="preserve">{{phase.title}} </w:t>
+      </w:r>
+      <w:r>
+        <w:rPr>
+          <w:rFonts w:eastAsia="Montserrat" w:cs="Montserrat" w:ascii="Montserrat" w:hAnsi="Montserrat"/>
+          <w:sz w:val="28"/>
+          <w:szCs w:val="28"/>
+        </w:rPr>
+        <w:t>({{phase.nbJEH}} JEH)</w:t>
+      </w:r>
+      <w:r>
+        <w:rPr>
+          <w:rFonts w:eastAsia="Montserrat" w:cs="Montserrat" w:ascii="Montserrat" w:hAnsi="Montserrat"/>
+          <w:b w:val="false"/>
+          <w:sz w:val="28"/>
+          <w:szCs w:val="28"/>
+        </w:rPr>
+        <w:t>.</w:t>
+      </w:r>
+      <w:r>
+        <w:rPr>
+          <w:rFonts w:eastAsia="Montserrat" w:cs="Montserrat" w:ascii="Montserrat" w:hAnsi="Montserrat"/>
+          <w:sz w:val="20"/>
+          <w:szCs w:val="20"/>
+        </w:rPr>
+        <w:t xml:space="preserve"> </w:t>
+      </w:r>
+    </w:p>
+    <w:p>
+      <w:pPr>
+        <w:pStyle w:val="normal1"/>
+        <w:widowControl w:val="false"/>
+        <w:spacing w:lineRule="auto" w:line="276" w:before="0" w:after="0"/>
+        <w:ind w:hanging="0"/>
+        <w:jc w:val="left"/>
+        <w:rPr>
+          <w:rFonts w:ascii="Montserrat" w:hAnsi="Montserrat" w:eastAsia="Montserrat" w:cs="Montserrat"/>
+          <w:sz w:val="20"/>
+          <w:szCs w:val="20"/>
+        </w:rPr>
+      </w:pPr>
+      <w:r>
+        <w:rPr>
+          <w:rFonts w:eastAsia="Montserrat" w:cs="Montserrat" w:ascii="Montserrat" w:hAnsi="Montserrat"/>
+          <w:sz w:val="20"/>
+          <w:szCs w:val="20"/>
+        </w:rPr>
+        <w:tab/>
+      </w:r>
+      <w:r>
+        <w:rPr>
+          <w:rFonts w:eastAsia="Montserrat" w:cs="Montserrat" w:ascii="Montserrat" w:hAnsi="Montserrat"/>
+          <w:b/>
+          <w:sz w:val="20"/>
+          <w:szCs w:val="20"/>
+        </w:rPr>
+        <w:t>Description</w:t>
+      </w:r>
+      <w:r>
+        <w:rPr>
+          <w:rFonts w:eastAsia="Montserrat" w:cs="Montserrat" w:ascii="Montserrat" w:hAnsi="Montserrat"/>
+          <w:sz w:val="20"/>
+          <w:szCs w:val="20"/>
+        </w:rPr>
+        <w:t xml:space="preserve"> : </w:t>
+      </w:r>
+    </w:p>
+    <w:p>
+      <w:pPr>
+        <w:pStyle w:val="normal1"/>
+        <w:widowControl w:val="false"/>
+        <w:spacing w:lineRule="auto" w:line="276" w:before="0" w:after="0"/>
+        <w:ind w:hanging="0"/>
+        <w:jc w:val="left"/>
+        <w:rPr>
+          <w:rFonts w:ascii="Montserrat" w:hAnsi="Montserrat" w:eastAsia="Montserrat" w:cs="Montserrat"/>
+          <w:sz w:val="20"/>
+          <w:szCs w:val="20"/>
+        </w:rPr>
+      </w:pPr>
+      <w:r>
+        <w:rPr>
+          <w:rFonts w:eastAsia="Montserrat" w:cs="Montserrat" w:ascii="Montserrat" w:hAnsi="Montserrat"/>
+          <w:sz w:val="20"/>
+          <w:szCs w:val="20"/>
+        </w:rPr>
+      </w:r>
+    </w:p>
+    <w:p>
+      <w:pPr>
+        <w:pStyle w:val="normal1"/>
+        <w:widowControl w:val="false"/>
+        <w:spacing w:lineRule="auto" w:line="276" w:before="0" w:after="0"/>
+        <w:ind w:hanging="0"/>
+        <w:jc w:val="left"/>
+        <w:rPr>
+          <w:rFonts w:ascii="Montserrat" w:hAnsi="Montserrat" w:eastAsia="Montserrat" w:cs="Montserrat"/>
+          <w:sz w:val="20"/>
+          <w:szCs w:val="20"/>
+        </w:rPr>
+      </w:pPr>
+      <w:r>
+        <w:rPr>
+          <w:rFonts w:eastAsia="Montserrat" w:cs="Montserrat" w:ascii="Montserrat" w:hAnsi="Montserrat"/>
+          <w:sz w:val="20"/>
+          <w:szCs w:val="20"/>
+        </w:rPr>
+        <w:t xml:space="preserve">{{ phase.description }} </w:t>
+      </w:r>
+    </w:p>
+    <w:p>
+      <w:pPr>
+        <w:pStyle w:val="normal1"/>
+        <w:widowControl w:val="false"/>
+        <w:spacing w:lineRule="auto" w:line="276" w:before="0" w:after="0"/>
+        <w:ind w:hanging="0"/>
+        <w:rPr>
+          <w:rFonts w:ascii="Montserrat" w:hAnsi="Montserrat" w:eastAsia="Montserrat" w:cs="Montserrat"/>
+          <w:sz w:val="20"/>
+          <w:szCs w:val="20"/>
+        </w:rPr>
+      </w:pPr>
+      <w:r>
+        <w:rPr>
+          <w:rFonts w:eastAsia="Montserrat" w:cs="Montserrat" w:ascii="Montserrat" w:hAnsi="Montserrat"/>
+          <w:sz w:val="20"/>
+          <w:szCs w:val="20"/>
+        </w:rPr>
+      </w:r>
+    </w:p>
+    <w:p>
+      <w:pPr>
+        <w:pStyle w:val="normal1"/>
+        <w:widowControl w:val="false"/>
+        <w:spacing w:lineRule="auto" w:line="276" w:before="0" w:after="0"/>
+        <w:ind w:firstLine="720"/>
+        <w:jc w:val="left"/>
+        <w:rPr>
+          <w:rFonts w:ascii="Montserrat" w:hAnsi="Montserrat" w:eastAsia="Montserrat" w:cs="Montserrat"/>
+          <w:sz w:val="20"/>
+          <w:szCs w:val="20"/>
+        </w:rPr>
+      </w:pPr>
+      <w:r>
+        <w:rPr>
+          <w:rFonts w:eastAsia="Montserrat" w:cs="Montserrat" w:ascii="Montserrat" w:hAnsi="Montserrat"/>
+          <w:b/>
+          <w:sz w:val="20"/>
+          <w:szCs w:val="20"/>
+        </w:rPr>
+        <w:t>Méthodologie</w:t>
+      </w:r>
+      <w:r>
+        <w:rPr>
+          <w:rFonts w:eastAsia="Montserrat" w:cs="Montserrat" w:ascii="Montserrat" w:hAnsi="Montserrat"/>
+          <w:sz w:val="20"/>
+          <w:szCs w:val="20"/>
+        </w:rPr>
+        <w:t xml:space="preserve"> : </w:t>
+      </w:r>
+    </w:p>
+    <w:p>
+      <w:pPr>
+        <w:pStyle w:val="normal1"/>
+        <w:widowControl w:val="false"/>
+        <w:spacing w:lineRule="auto" w:line="276" w:before="0" w:after="0"/>
+        <w:ind w:hanging="0"/>
+        <w:jc w:val="left"/>
+        <w:rPr>
+          <w:rFonts w:ascii="Montserrat" w:hAnsi="Montserrat" w:eastAsia="Montserrat" w:cs="Montserrat"/>
+          <w:sz w:val="20"/>
+          <w:szCs w:val="20"/>
+        </w:rPr>
+      </w:pPr>
+      <w:r>
+        <w:rPr>
+          <w:rFonts w:eastAsia="Montserrat" w:cs="Montserrat" w:ascii="Montserrat" w:hAnsi="Montserrat"/>
+          <w:sz w:val="20"/>
+          <w:szCs w:val="20"/>
+        </w:rPr>
+      </w:r>
+    </w:p>
+    <w:p>
+      <w:pPr>
+        <w:pStyle w:val="normal1"/>
+        <w:widowControl w:val="false"/>
+        <w:spacing w:lineRule="auto" w:line="276" w:before="0" w:after="0"/>
+        <w:ind w:hanging="0"/>
+        <w:jc w:val="left"/>
+        <w:rPr>
+          <w:rFonts w:ascii="Montserrat" w:hAnsi="Montserrat" w:eastAsia="Montserrat" w:cs="Montserrat"/>
+          <w:sz w:val="20"/>
+          <w:szCs w:val="20"/>
+        </w:rPr>
+      </w:pPr>
+      <w:r>
+        <w:rPr>
+          <w:rFonts w:eastAsia="Montserrat" w:cs="Montserrat" w:ascii="Montserrat" w:hAnsi="Montserrat"/>
+          <w:sz w:val="20"/>
+          <w:szCs w:val="20"/>
+        </w:rPr>
+        <w:t xml:space="preserve">{{ phase.methodologie }} </w:t>
+      </w:r>
+    </w:p>
+    <w:p>
+      <w:pPr>
+        <w:pStyle w:val="normal1"/>
+        <w:widowControl w:val="false"/>
+        <w:spacing w:lineRule="auto" w:line="276" w:before="0" w:after="0"/>
+        <w:ind w:hanging="0"/>
+        <w:rPr>
+          <w:rFonts w:ascii="Montserrat" w:hAnsi="Montserrat" w:eastAsia="Montserrat" w:cs="Montserrat"/>
+          <w:sz w:val="20"/>
+          <w:szCs w:val="20"/>
+        </w:rPr>
+      </w:pPr>
+      <w:r>
+        <w:rPr>
+          <w:rFonts w:eastAsia="Montserrat" w:cs="Montserrat" w:ascii="Montserrat" w:hAnsi="Montserrat"/>
+          <w:sz w:val="20"/>
+          <w:szCs w:val="20"/>
+        </w:rPr>
+      </w:r>
+    </w:p>
+    <w:p>
+      <w:pPr>
+        <w:pStyle w:val="normal1"/>
+        <w:widowControl w:val="false"/>
+        <w:spacing w:lineRule="auto" w:line="276" w:before="0" w:after="0"/>
+        <w:ind w:hanging="0"/>
+        <w:rPr>
+          <w:rFonts w:ascii="Montserrat" w:hAnsi="Montserrat" w:eastAsia="Montserrat" w:cs="Montserrat"/>
+          <w:sz w:val="20"/>
+          <w:szCs w:val="20"/>
+        </w:rPr>
+      </w:pPr>
+      <w:r>
+        <w:rPr>
+          <w:rFonts w:eastAsia="Montserrat" w:cs="Montserrat" w:ascii="Montserrat" w:hAnsi="Montserrat"/>
+          <w:sz w:val="20"/>
+          <w:szCs w:val="20"/>
+        </w:rPr>
+        <w:t>{%endfor%}</w:t>
+      </w:r>
+    </w:p>
+    <w:p>
+      <w:pPr>
+        <w:pStyle w:val="normal1"/>
         <w:spacing w:lineRule="auto" w:line="240" w:before="0" w:after="0"/>
         <w:ind w:hanging="0"/>
         <w:rPr>
@@ -2956,8 +3310,8 @@
         <w:pStyle w:val="Heading2"/>
         <w:rPr/>
       </w:pPr>
-      <w:bookmarkStart w:id="12" w:name="_heading=h.c508lzvqqbjg"/>
-      <w:bookmarkEnd w:id="12"/>
+      <w:bookmarkStart w:id="13" w:name="_heading=h.c508lzvqqbjg"/>
+      <w:bookmarkEnd w:id="13"/>
       <w:r>
         <w:rPr/>
         <w:t>2 - Point de contrôle et validation client</w:t>
@@ -3159,8 +3513,8 @@
         <w:pStyle w:val="Heading2"/>
         <w:rPr/>
       </w:pPr>
-      <w:bookmarkStart w:id="13" w:name="_heading=h.17dp8vu"/>
-      <w:bookmarkEnd w:id="13"/>
+      <w:bookmarkStart w:id="14" w:name="_heading=h.17dp8vu"/>
+      <w:bookmarkEnd w:id="14"/>
       <w:r>
         <w:rPr/>
         <w:t>3 - L’accompagnement offert par Ouest INSA sur votre étude</w:t>
@@ -3335,8 +3689,8 @@
           <w:szCs w:val="24"/>
         </w:rPr>
       </w:pPr>
-      <w:bookmarkStart w:id="14" w:name="_heading=h.3rdcrjn"/>
-      <w:bookmarkEnd w:id="14"/>
+      <w:bookmarkStart w:id="15" w:name="_heading=h.3rdcrjn"/>
+      <w:bookmarkEnd w:id="15"/>
       <w:r>
         <w:rPr/>
         <w:t>4 -</w:t>
@@ -3412,8 +3766,8 @@
         <w:pStyle w:val="Heading2"/>
         <w:rPr/>
       </w:pPr>
-      <w:bookmarkStart w:id="15" w:name="_heading=h.26in1rg"/>
-      <w:bookmarkEnd w:id="15"/>
+      <w:bookmarkStart w:id="16" w:name="_heading=h.26in1rg"/>
+      <w:bookmarkEnd w:id="16"/>
       <w:r>
         <w:rPr/>
         <w:t>5 - Cadre pédagogique mis en place</w:t>
@@ -3521,8 +3875,8 @@
           <w:szCs w:val="20"/>
         </w:rPr>
       </w:pPr>
-      <w:bookmarkStart w:id="16" w:name="_heading=h.lnxbz9"/>
-      <w:bookmarkEnd w:id="16"/>
+      <w:bookmarkStart w:id="17" w:name="_heading=h.lnxbz9"/>
+      <w:bookmarkEnd w:id="17"/>
       <w:r>
         <w:rPr>
           <w:rFonts w:eastAsia="Montserrat" w:cs="Montserrat" w:ascii="Montserrat" w:hAnsi="Montserrat"/>
@@ -3560,8 +3914,8 @@
         <w:pStyle w:val="Heading1"/>
         <w:rPr/>
       </w:pPr>
-      <w:bookmarkStart w:id="17" w:name="_heading=h.35nkun2"/>
-      <w:bookmarkEnd w:id="17"/>
+      <w:bookmarkStart w:id="18" w:name="_heading=h.35nkun2"/>
+      <w:bookmarkEnd w:id="18"/>
       <w:r>
         <w:rPr/>
         <w:t>VI. L’intervenant choisi pour votre étude</w:t>
@@ -3582,23 +3936,7 @@
           <w:sz w:val="20"/>
           <w:szCs w:val="20"/>
         </w:rPr>
-        <w:t>{{ etude.docEtude.real</w:t>
-      </w:r>
-      <w:r>
-        <w:rPr>
-          <w:rFonts w:eastAsia="Montserrat" w:cs="Montserrat" w:ascii="Montserrat" w:hAnsi="Montserrat"/>
-          <w:sz w:val="20"/>
-          <w:szCs w:val="20"/>
-        </w:rPr>
-        <w:t>_d</w:t>
-      </w:r>
-      <w:r>
-        <w:rPr>
-          <w:rFonts w:eastAsia="Montserrat" w:cs="Montserrat" w:ascii="Montserrat" w:hAnsi="Montserrat"/>
-          <w:sz w:val="20"/>
-          <w:szCs w:val="20"/>
-        </w:rPr>
-        <w:t>esc }}</w:t>
+        <w:t>{{ etude.docEtude.real_desc }}</w:t>
       </w:r>
     </w:p>
     <w:p>
@@ -3606,8 +3944,8 @@
         <w:pStyle w:val="Heading1"/>
         <w:rPr/>
       </w:pPr>
-      <w:bookmarkStart w:id="18" w:name="_heading=h.8s6bqhyn9mrb"/>
-      <w:bookmarkEnd w:id="18"/>
+      <w:bookmarkStart w:id="19" w:name="_heading=h.8s6bqhyn9mrb"/>
+      <w:bookmarkEnd w:id="19"/>
       <w:r>
         <w:rPr>
           <w:sz w:val="30"/>
@@ -3701,8 +4039,8 @@
         <w:pStyle w:val="Heading1"/>
         <w:rPr/>
       </w:pPr>
-      <w:bookmarkStart w:id="19" w:name="_heading=h.g7gjvaaru1xx"/>
-      <w:bookmarkEnd w:id="19"/>
+      <w:bookmarkStart w:id="20" w:name="_heading=h.g7gjvaaru1xx"/>
+      <w:bookmarkEnd w:id="20"/>
       <w:commentRangeStart w:id="1"/>
       <w:sdt>
         <w:sdtPr>
@@ -3726,16 +4064,6 @@
       <w:r>
         <w:commentReference w:id="1"/>
       </w:r>
-      <w:r>
-        <w:rPr/>
-      </w:r>
-    </w:p>
-    <w:p>
-      <w:pPr>
-        <w:pStyle w:val="normal1"/>
-        <w:ind w:hanging="0"/>
-        <w:rPr/>
-      </w:pPr>
       <w:r>
         <w:rPr/>
       </w:r>
@@ -3959,7 +4287,27 @@
                 <w:sz w:val="20"/>
                 <w:szCs w:val="20"/>
               </w:rPr>
-              <w:t>{% for phase in etude.phaseEtude.all() %}Phase {{ phase.index }} : {{ phase.title }}</w:t>
+              <w:t>{% for phase in etude.phaseEtude.all()</w:t>
+            </w:r>
+            <w:r>
+              <w:rPr>
+                <w:rFonts w:eastAsia="Montserrat SemiBold" w:cs="Montserrat SemiBold" w:ascii="Montserrat SemiBold" w:hAnsi="Montserrat SemiBold"/>
+                <w:b/>
+                <w:color w:val="FFFFFF"/>
+                <w:sz w:val="20"/>
+                <w:szCs w:val="20"/>
+              </w:rPr>
+              <w:t>|phasesReal()</w:t>
+            </w:r>
+            <w:r>
+              <w:rPr>
+                <w:rFonts w:eastAsia="Montserrat SemiBold" w:cs="Montserrat SemiBold" w:ascii="Montserrat SemiBold" w:hAnsi="Montserrat SemiBold"/>
+                <w:b/>
+                <w:color w:val="FFFFFF"/>
+                <w:sz w:val="20"/>
+                <w:szCs w:val="20"/>
+              </w:rPr>
+              <w:t xml:space="preserve"> %}Phase {{ phase.index }} : {{ phase.title }}</w:t>
             </w:r>
           </w:p>
         </w:tc>
@@ -4106,7 +4454,7 @@
                 <w:sz w:val="20"/>
                 <w:szCs w:val="20"/>
               </w:rPr>
-              <w:t>{{ phase.nbJEH*phase.priceJEH }}{%endfor%}</w:t>
+              <w:t>{{ phase.nbJEH*phase.priceJEH }}</w:t>
             </w:r>
           </w:p>
         </w:tc>
@@ -4134,7 +4482,8 @@
               <w:jc w:val="left"/>
               <w:rPr>
                 <w:rFonts w:ascii="Montserrat SemiBold" w:hAnsi="Montserrat SemiBold" w:eastAsia="Montserrat SemiBold" w:cs="Montserrat SemiBold"/>
-                <w:color w:val="000000"/>
+                <w:b/>
+                <w:color w:val="FFFFFF"/>
                 <w:sz w:val="20"/>
                 <w:szCs w:val="20"/>
               </w:rPr>
@@ -4142,10 +4491,12 @@
             <w:r>
               <w:rPr>
                 <w:rFonts w:eastAsia="Montserrat SemiBold" w:cs="Montserrat SemiBold" w:ascii="Montserrat SemiBold" w:hAnsi="Montserrat SemiBold"/>
-                <w:color w:val="000000"/>
+                <w:b/>
+                <w:color w:val="FFFFFF"/>
                 <w:sz w:val="20"/>
                 <w:szCs w:val="20"/>
               </w:rPr>
+              <w:t>{%endfor%}</w:t>
             </w:r>
           </w:p>
         </w:tc>
@@ -4153,7 +4504,7 @@
     </w:tbl>
     <w:p>
       <w:pPr>
-        <w:pStyle w:val="normal1"/>
+        <w:pStyle w:val="Normal"/>
         <w:ind w:hanging="0"/>
         <w:rPr>
           <w:rFonts w:ascii="Montserrat SemiBold" w:hAnsi="Montserrat SemiBold" w:eastAsia="Montserrat SemiBold" w:cs="Montserrat SemiBold"/>
@@ -4399,25 +4750,7 @@
                 <w:sz w:val="20"/>
                 <w:szCs w:val="20"/>
               </w:rPr>
-              <w:t>{{etude.</w:t>
-            </w:r>
-            <w:r>
-              <w:rPr>
-                <w:rFonts w:eastAsia="Montserrat SemiBold" w:cs="Montserrat SemiBold" w:ascii="Montserrat SemiBold" w:hAnsi="Montserrat SemiBold"/>
-                <w:b/>
-                <w:sz w:val="20"/>
-                <w:szCs w:val="20"/>
-              </w:rPr>
-              <w:t>docEtude.</w:t>
-            </w:r>
-            <w:r>
-              <w:rPr>
-                <w:rFonts w:eastAsia="Montserrat SemiBold" w:cs="Montserrat SemiBold" w:ascii="Montserrat SemiBold" w:hAnsi="Montserrat SemiBold"/>
-                <w:b/>
-                <w:sz w:val="20"/>
-                <w:szCs w:val="20"/>
-              </w:rPr>
-              <w:t>application_fees}}</w:t>
+              <w:t>{{etude.docEtude.application_fees}}</w:t>
             </w:r>
             <w:r>
               <w:rPr>
@@ -4467,39 +4800,7 @@
                 <w:sz w:val="20"/>
                 <w:szCs w:val="20"/>
               </w:rPr>
-              <w:t>{{ etude.</w:t>
-            </w:r>
-            <w:r>
-              <w:rPr>
-                <w:rFonts w:eastAsia="Montserrat SemiBold" w:cs="Montserrat SemiBold" w:ascii="Montserrat SemiBold" w:hAnsi="Montserrat SemiBold"/>
-                <w:sz w:val="20"/>
-                <w:szCs w:val="20"/>
-              </w:rPr>
-              <w:t>docEtude.</w:t>
-            </w:r>
-            <w:r>
-              <w:rPr>
-                <w:rFonts w:eastAsia="Montserrat SemiBold" w:cs="Montserrat SemiBold" w:ascii="Montserrat SemiBold" w:hAnsi="Montserrat SemiBold"/>
-                <w:sz w:val="20"/>
-                <w:szCs w:val="20"/>
-              </w:rPr>
-              <w:t>application_fees | nbrToLetters() }} euro{%if etude.</w:t>
-            </w:r>
-            <w:r>
-              <w:rPr>
-                <w:rFonts w:eastAsia="Montserrat SemiBold" w:cs="Montserrat SemiBold" w:ascii="Montserrat SemiBold" w:hAnsi="Montserrat SemiBold"/>
-                <w:sz w:val="20"/>
-                <w:szCs w:val="20"/>
-              </w:rPr>
-              <w:t>docEtude.</w:t>
-            </w:r>
-            <w:r>
-              <w:rPr>
-                <w:rFonts w:eastAsia="Montserrat SemiBold" w:cs="Montserrat SemiBold" w:ascii="Montserrat SemiBold" w:hAnsi="Montserrat SemiBold"/>
-                <w:sz w:val="20"/>
-                <w:szCs w:val="20"/>
-              </w:rPr>
-              <w:t>application_fees&gt;1%}s{%endif%}</w:t>
+              <w:t>{{ etude.docEtude.application_fees | nbrToLetters() }} euro{%if etude.docEtude.application_fees&gt;1%}s{%endif%}</w:t>
             </w:r>
             <w:r>
               <w:rPr>
@@ -5022,8 +5323,8 @@
         <w:tblLook w:val="0400"/>
       </w:tblPr>
       <w:tblGrid>
-        <w:gridCol w:w="3358"/>
-        <w:gridCol w:w="2897"/>
+        <w:gridCol w:w="3355"/>
+        <w:gridCol w:w="2900"/>
         <w:gridCol w:w="3330"/>
       </w:tblGrid>
       <w:tr>
@@ -5032,7 +5333,7 @@
         </w:trPr>
         <w:tc>
           <w:tcPr>
-            <w:tcW w:w="3358" w:type="dxa"/>
+            <w:tcW w:w="3355" w:type="dxa"/>
             <w:tcBorders>
               <w:top w:val="single" w:sz="4" w:space="0" w:color="000000"/>
               <w:bottom w:val="single" w:sz="4" w:space="0" w:color="000000"/>
@@ -5069,7 +5370,7 @@
         </w:tc>
         <w:tc>
           <w:tcPr>
-            <w:tcW w:w="2897" w:type="dxa"/>
+            <w:tcW w:w="2900" w:type="dxa"/>
             <w:tcBorders>
               <w:top w:val="single" w:sz="4" w:space="0" w:color="000000"/>
               <w:bottom w:val="single" w:sz="4" w:space="0" w:color="000000"/>
@@ -5154,7 +5455,7 @@
         </w:trPr>
         <w:tc>
           <w:tcPr>
-            <w:tcW w:w="3358" w:type="dxa"/>
+            <w:tcW w:w="3355" w:type="dxa"/>
             <w:tcBorders>
               <w:top w:val="single" w:sz="4" w:space="0" w:color="000000"/>
               <w:bottom w:val="single" w:sz="4" w:space="0" w:color="000000"/>
@@ -5189,7 +5490,7 @@
         </w:tc>
         <w:tc>
           <w:tcPr>
-            <w:tcW w:w="2897" w:type="dxa"/>
+            <w:tcW w:w="2900" w:type="dxa"/>
             <w:tcBorders>
               <w:top w:val="single" w:sz="4" w:space="0" w:color="000000"/>
               <w:bottom w:val="single" w:sz="4" w:space="0" w:color="000000"/>
@@ -5230,23 +5531,7 @@
                 <w:sz w:val="20"/>
                 <w:szCs w:val="20"/>
               </w:rPr>
-              <w:t>{{etude.docEtud</w:t>
-            </w:r>
-            <w:r>
-              <w:rPr>
-                <w:rFonts w:eastAsia="Montserrat SemiBold" w:cs="Montserrat SemiBold" w:ascii="Montserrat SemiBold" w:hAnsi="Montserrat SemiBold"/>
-                <w:sz w:val="20"/>
-                <w:szCs w:val="20"/>
-              </w:rPr>
-              <w:t>e.depositAmount</w:t>
-            </w:r>
-            <w:r>
-              <w:rPr>
-                <w:rFonts w:eastAsia="Montserrat SemiBold" w:cs="Montserrat SemiBold" w:ascii="Montserrat SemiBold" w:hAnsi="Montserrat SemiBold"/>
-                <w:sz w:val="20"/>
-                <w:szCs w:val="20"/>
-              </w:rPr>
-              <w:t>}}</w:t>
+              <w:t>{{etude.docEtude.depositAmount}}</w:t>
             </w:r>
             <w:r>
               <w:rPr>
@@ -5322,7 +5607,7 @@
         </w:trPr>
         <w:tc>
           <w:tcPr>
-            <w:tcW w:w="3358" w:type="dxa"/>
+            <w:tcW w:w="3355" w:type="dxa"/>
             <w:tcBorders>
               <w:top w:val="single" w:sz="4" w:space="0" w:color="000000"/>
               <w:bottom w:val="single" w:sz="4" w:space="0" w:color="000000"/>
@@ -5357,7 +5642,7 @@
         </w:tc>
         <w:tc>
           <w:tcPr>
-            <w:tcW w:w="2897" w:type="dxa"/>
+            <w:tcW w:w="2900" w:type="dxa"/>
             <w:tcBorders>
               <w:top w:val="single" w:sz="4" w:space="0" w:color="000000"/>
               <w:bottom w:val="single" w:sz="4" w:space="0" w:color="000000"/>
@@ -5389,23 +5674,7 @@
                 <w:sz w:val="20"/>
                 <w:szCs w:val="20"/>
               </w:rPr>
-              <w:t>{{ rd(total_HT*etude.docEtud</w:t>
-            </w:r>
-            <w:r>
-              <w:rPr>
-                <w:rFonts w:eastAsia="Montserrat SemiBold" w:cs="Montserrat SemiBold" w:ascii="Montserrat SemiBold" w:hAnsi="Montserrat SemiBold"/>
-                <w:sz w:val="20"/>
-                <w:szCs w:val="20"/>
-              </w:rPr>
-              <w:t>e.depositAmount</w:t>
-            </w:r>
-            <w:r>
-              <w:rPr>
-                <w:rFonts w:eastAsia="Montserrat SemiBold" w:cs="Montserrat SemiBold" w:ascii="Montserrat SemiBold" w:hAnsi="Montserrat SemiBold"/>
-                <w:sz w:val="20"/>
-                <w:szCs w:val="20"/>
-              </w:rPr>
-              <w:t>/100) }}</w:t>
+              <w:t>{{ rd(total_HT*etude.docEtude.depositAmount/100) }}</w:t>
             </w:r>
             <w:r>
               <w:rPr>
@@ -5452,23 +5721,7 @@
                 <w:sz w:val="20"/>
                 <w:szCs w:val="20"/>
               </w:rPr>
-              <w:t>{{rd(total_HT-total_HT*etude.docEtud</w:t>
-            </w:r>
-            <w:r>
-              <w:rPr>
-                <w:rFonts w:eastAsia="Montserrat SemiBold" w:cs="Montserrat SemiBold" w:ascii="Montserrat SemiBold" w:hAnsi="Montserrat SemiBold"/>
-                <w:sz w:val="20"/>
-                <w:szCs w:val="20"/>
-              </w:rPr>
-              <w:t>e.depositAmount</w:t>
-            </w:r>
-            <w:r>
-              <w:rPr>
-                <w:rFonts w:eastAsia="Montserrat SemiBold" w:cs="Montserrat SemiBold" w:ascii="Montserrat SemiBold" w:hAnsi="Montserrat SemiBold"/>
-                <w:sz w:val="20"/>
-                <w:szCs w:val="20"/>
-              </w:rPr>
-              <w:t>/100) }}</w:t>
+              <w:t>{{rd(total_HT-total_HT*etude.docEtude.depositAmount/100) }}</w:t>
             </w:r>
             <w:r>
               <w:rPr>
@@ -5488,7 +5741,7 @@
         </w:trPr>
         <w:tc>
           <w:tcPr>
-            <w:tcW w:w="3358" w:type="dxa"/>
+            <w:tcW w:w="3355" w:type="dxa"/>
             <w:tcBorders>
               <w:top w:val="single" w:sz="4" w:space="0" w:color="000000"/>
               <w:bottom w:val="single" w:sz="4" w:space="0" w:color="000000"/>
@@ -5523,7 +5776,7 @@
         </w:tc>
         <w:tc>
           <w:tcPr>
-            <w:tcW w:w="2897" w:type="dxa"/>
+            <w:tcW w:w="2900" w:type="dxa"/>
             <w:tcBorders>
               <w:top w:val="single" w:sz="4" w:space="0" w:color="000000"/>
               <w:bottom w:val="single" w:sz="4" w:space="0" w:color="000000"/>
@@ -5555,23 +5808,7 @@
                 <w:sz w:val="20"/>
                 <w:szCs w:val="20"/>
               </w:rPr>
-              <w:t>{{ rd(total_ttc*etude.docEtud</w:t>
-            </w:r>
-            <w:r>
-              <w:rPr>
-                <w:rFonts w:eastAsia="Montserrat SemiBold" w:cs="Montserrat SemiBold" w:ascii="Montserrat SemiBold" w:hAnsi="Montserrat SemiBold"/>
-                <w:sz w:val="20"/>
-                <w:szCs w:val="20"/>
-              </w:rPr>
-              <w:t>e.depositAmount</w:t>
-            </w:r>
-            <w:r>
-              <w:rPr>
-                <w:rFonts w:eastAsia="Montserrat SemiBold" w:cs="Montserrat SemiBold" w:ascii="Montserrat SemiBold" w:hAnsi="Montserrat SemiBold"/>
-                <w:sz w:val="20"/>
-                <w:szCs w:val="20"/>
-              </w:rPr>
-              <w:t>/100) }}</w:t>
+              <w:t>{{ rd(total_ttc*etude.docEtude.depositAmount/100) }}</w:t>
             </w:r>
             <w:r>
               <w:rPr>
@@ -5618,23 +5855,7 @@
                 <w:sz w:val="20"/>
                 <w:szCs w:val="20"/>
               </w:rPr>
-              <w:t>{{rd(total_ttc-total_ttc*etude.docEtud</w:t>
-            </w:r>
-            <w:r>
-              <w:rPr>
-                <w:rFonts w:eastAsia="Montserrat SemiBold" w:cs="Montserrat SemiBold" w:ascii="Montserrat SemiBold" w:hAnsi="Montserrat SemiBold"/>
-                <w:sz w:val="20"/>
-                <w:szCs w:val="20"/>
-              </w:rPr>
-              <w:t>e.depositAmount</w:t>
-            </w:r>
-            <w:r>
-              <w:rPr>
-                <w:rFonts w:eastAsia="Montserrat SemiBold" w:cs="Montserrat SemiBold" w:ascii="Montserrat SemiBold" w:hAnsi="Montserrat SemiBold"/>
-                <w:sz w:val="20"/>
-                <w:szCs w:val="20"/>
-              </w:rPr>
-              <w:t>/100) }}</w:t>
+              <w:t>{{rd(total_ttc-total_ttc*etude.docEtude.depositAmount/100) }}</w:t>
             </w:r>
             <w:r>
               <w:rPr>
@@ -5695,8 +5916,8 @@
         <w:pStyle w:val="Heading1"/>
         <w:rPr/>
       </w:pPr>
-      <w:bookmarkStart w:id="20" w:name="_heading=h.2xcytpi"/>
-      <w:bookmarkEnd w:id="20"/>
+      <w:bookmarkStart w:id="21" w:name="_heading=h.2xcytpi"/>
+      <w:bookmarkEnd w:id="21"/>
       <w:commentRangeStart w:id="2"/>
       <w:sdt>
         <w:sdtPr>
@@ -6021,8 +6242,8 @@
         <w:pStyle w:val="Heading1"/>
         <w:rPr/>
       </w:pPr>
-      <w:bookmarkStart w:id="21" w:name="_heading=h.1ci93xb"/>
-      <w:bookmarkEnd w:id="21"/>
+      <w:bookmarkStart w:id="22" w:name="_heading=h.1ci93xb"/>
+      <w:bookmarkEnd w:id="22"/>
       <w:r>
         <w:rPr/>
         <w:t>X. Conditions générales de l’étude</w:t>
@@ -6078,8 +6299,8 @@
           <w:color w:val="365F91"/>
         </w:rPr>
       </w:pPr>
-      <w:bookmarkStart w:id="22" w:name="_heading=h.3whwml4"/>
-      <w:bookmarkEnd w:id="22"/>
+      <w:bookmarkStart w:id="23" w:name="_heading=h.3whwml4"/>
+      <w:bookmarkEnd w:id="23"/>
       <w:r>
         <w:rPr>
           <w:color w:val="365F91"/>
@@ -6228,8 +6449,8 @@
         <w:pStyle w:val="Heading3"/>
         <w:rPr/>
       </w:pPr>
-      <w:bookmarkStart w:id="23" w:name="_heading=h.2bn6wsx"/>
-      <w:bookmarkEnd w:id="23"/>
+      <w:bookmarkStart w:id="24" w:name="_heading=h.2bn6wsx"/>
+      <w:bookmarkEnd w:id="24"/>
       <w:r>
         <w:rPr/>
         <w:t>Article 2 : Collaboration</w:t>
@@ -6306,8 +6527,8 @@
         <w:pStyle w:val="Heading3"/>
         <w:rPr/>
       </w:pPr>
-      <w:bookmarkStart w:id="24" w:name="_heading=h.qsh70q"/>
-      <w:bookmarkEnd w:id="24"/>
+      <w:bookmarkStart w:id="25" w:name="_heading=h.qsh70q"/>
+      <w:bookmarkEnd w:id="25"/>
       <w:r>
         <w:rPr/>
         <w:t>Article 3 : Responsabilités</w:t>
@@ -6379,8 +6600,8 @@
         <w:pStyle w:val="Heading3"/>
         <w:rPr/>
       </w:pPr>
-      <w:bookmarkStart w:id="25" w:name="_heading=h.xuvkrnsd42fu"/>
-      <w:bookmarkEnd w:id="25"/>
+      <w:bookmarkStart w:id="26" w:name="_heading=h.xuvkrnsd42fu"/>
+      <w:bookmarkEnd w:id="26"/>
       <w:r>
         <w:rPr/>
         <w:t>Article 4 : Délais de réalisation</w:t>
@@ -6397,8 +6618,8 @@
           <w:szCs w:val="16"/>
         </w:rPr>
       </w:pPr>
-      <w:bookmarkStart w:id="26" w:name="_heading=h.1pxezwc"/>
-      <w:bookmarkEnd w:id="26"/>
+      <w:bookmarkStart w:id="27" w:name="_heading=h.1pxezwc"/>
+      <w:bookmarkEnd w:id="27"/>
       <w:r>
         <w:rPr>
           <w:rFonts w:eastAsia="Montserrat" w:cs="Montserrat" w:ascii="Montserrat" w:hAnsi="Montserrat"/>
@@ -6426,17 +6647,17 @@
           <w:szCs w:val="16"/>
         </w:rPr>
       </w:r>
-      <w:bookmarkStart w:id="27" w:name="_heading=h.8ss01ln3mmv6"/>
       <w:bookmarkStart w:id="28" w:name="_heading=h.8ss01ln3mmv6"/>
-      <w:bookmarkEnd w:id="28"/>
+      <w:bookmarkStart w:id="29" w:name="_heading=h.8ss01ln3mmv6"/>
+      <w:bookmarkEnd w:id="29"/>
     </w:p>
     <w:p>
       <w:pPr>
         <w:pStyle w:val="Heading3"/>
         <w:rPr/>
       </w:pPr>
-      <w:bookmarkStart w:id="29" w:name="_heading=h.49x2ik5"/>
-      <w:bookmarkEnd w:id="29"/>
+      <w:bookmarkStart w:id="30" w:name="_heading=h.49x2ik5"/>
+      <w:bookmarkEnd w:id="30"/>
       <w:r>
         <w:rPr/>
         <w:t>Article 5 : Budget</w:t>
@@ -6512,8 +6733,8 @@
         <w:pStyle w:val="Heading3"/>
         <w:rPr/>
       </w:pPr>
-      <w:bookmarkStart w:id="30" w:name="_heading=h.147n2zr"/>
-      <w:bookmarkEnd w:id="30"/>
+      <w:bookmarkStart w:id="31" w:name="_heading=h.147n2zr"/>
+      <w:bookmarkEnd w:id="31"/>
       <w:r>
         <w:rPr/>
         <w:t>Article 6 : Conditions de paiement</w:t>
@@ -6885,8 +7106,8 @@
         <w:pStyle w:val="Heading3"/>
         <w:rPr/>
       </w:pPr>
-      <w:bookmarkStart w:id="31" w:name="_heading=h.3o7alnk"/>
-      <w:bookmarkEnd w:id="31"/>
+      <w:bookmarkStart w:id="32" w:name="_heading=h.3o7alnk"/>
+      <w:bookmarkEnd w:id="32"/>
       <w:r>
         <w:rPr/>
         <w:t>Article 7 : Garantie de la prestation</w:t>
@@ -7008,8 +7229,8 @@
         <w:pStyle w:val="Heading3"/>
         <w:rPr/>
       </w:pPr>
-      <w:bookmarkStart w:id="32" w:name="_heading=h.23ckvvd"/>
-      <w:bookmarkEnd w:id="32"/>
+      <w:bookmarkStart w:id="33" w:name="_heading=h.23ckvvd"/>
+      <w:bookmarkEnd w:id="33"/>
       <w:r>
         <w:rPr/>
         <w:t>Article 8 : Force majeure</w:t>
@@ -7060,8 +7281,8 @@
         <w:pStyle w:val="Heading3"/>
         <w:rPr/>
       </w:pPr>
-      <w:bookmarkStart w:id="33" w:name="_heading=h.ihv636"/>
-      <w:bookmarkEnd w:id="33"/>
+      <w:bookmarkStart w:id="34" w:name="_heading=h.ihv636"/>
+      <w:bookmarkEnd w:id="34"/>
       <w:r>
         <w:rPr/>
         <w:t>Article 9 : Modifications</w:t>
@@ -7109,8 +7330,8 @@
         <w:pStyle w:val="Heading3"/>
         <w:rPr/>
       </w:pPr>
-      <w:bookmarkStart w:id="34" w:name="_heading=h.32hioqz"/>
-      <w:bookmarkEnd w:id="34"/>
+      <w:bookmarkStart w:id="35" w:name="_heading=h.32hioqz"/>
+      <w:bookmarkEnd w:id="35"/>
       <w:r>
         <w:rPr/>
         <w:t xml:space="preserve">Article 10 : Résiliation </w:t>
@@ -7210,8 +7431,8 @@
         <w:pStyle w:val="Heading3"/>
         <w:rPr/>
       </w:pPr>
-      <w:bookmarkStart w:id="35" w:name="_heading=h.lf6vc5hl6suh"/>
-      <w:bookmarkEnd w:id="35"/>
+      <w:bookmarkStart w:id="36" w:name="_heading=h.lf6vc5hl6suh"/>
+      <w:bookmarkEnd w:id="36"/>
       <w:commentRangeStart w:id="4"/>
       <w:sdt>
         <w:sdtPr>
@@ -7307,17 +7528,17 @@
       <w:r>
         <w:rPr/>
       </w:r>
-      <w:bookmarkStart w:id="36" w:name="_heading=h.tipalyha6y9y"/>
       <w:bookmarkStart w:id="37" w:name="_heading=h.tipalyha6y9y"/>
-      <w:bookmarkEnd w:id="37"/>
+      <w:bookmarkStart w:id="38" w:name="_heading=h.tipalyha6y9y"/>
+      <w:bookmarkEnd w:id="38"/>
     </w:p>
     <w:p>
       <w:pPr>
         <w:pStyle w:val="Heading3"/>
         <w:rPr/>
       </w:pPr>
-      <w:bookmarkStart w:id="38" w:name="_heading=h.41mghml"/>
-      <w:bookmarkEnd w:id="38"/>
+      <w:bookmarkStart w:id="39" w:name="_heading=h.41mghml"/>
+      <w:bookmarkEnd w:id="39"/>
       <w:r>
         <w:rPr/>
         <w:t>Article 12 : Propriété de l’étude</w:t>
@@ -7494,8 +7715,8 @@
           <w:szCs w:val="16"/>
         </w:rPr>
       </w:pPr>
-      <w:bookmarkStart w:id="39" w:name="_heading=h.2grqrue"/>
-      <w:bookmarkEnd w:id="39"/>
+      <w:bookmarkStart w:id="40" w:name="_heading=h.2grqrue"/>
+      <w:bookmarkEnd w:id="40"/>
       <w:r>
         <w:rPr/>
         <w:t>Article 13 : Litig</w:t>
@@ -7581,8 +7802,8 @@
         <w:pStyle w:val="Heading3"/>
         <w:rPr/>
       </w:pPr>
-      <w:bookmarkStart w:id="40" w:name="_heading=h.vx1227"/>
-      <w:bookmarkEnd w:id="40"/>
+      <w:bookmarkStart w:id="41" w:name="_heading=h.vx1227"/>
+      <w:bookmarkEnd w:id="41"/>
       <w:r>
         <w:rPr/>
         <w:t>Article 14 : Loi Informatique et Libertés</w:t>
@@ -7692,8 +7913,8 @@
         <w:pStyle w:val="Heading3"/>
         <w:rPr/>
       </w:pPr>
-      <w:bookmarkStart w:id="41" w:name="_heading=h.3fwokq0"/>
-      <w:bookmarkEnd w:id="41"/>
+      <w:bookmarkStart w:id="42" w:name="_heading=h.3fwokq0"/>
+      <w:bookmarkEnd w:id="42"/>
       <w:r>
         <w:rPr/>
         <w:t>Article 15 : Lettre recommandée électronique</w:t>
@@ -7914,8 +8135,8 @@
         <w:pStyle w:val="Heading3"/>
         <w:rPr/>
       </w:pPr>
-      <w:bookmarkStart w:id="42" w:name="_heading=h.1v1yuxt"/>
-      <w:bookmarkEnd w:id="42"/>
+      <w:bookmarkStart w:id="43" w:name="_heading=h.1v1yuxt"/>
+      <w:bookmarkEnd w:id="43"/>
       <w:r>
         <w:rPr/>
         <w:t>Article 16 : Prise d’effet de la Convention</w:t>
@@ -8613,7 +8834,7 @@
           </w:r>
           <w:r>
             <w:rPr/>
-            <w:t>3</w:t>
+            <w:t>4</w:t>
           </w:r>
           <w:r>
             <w:rPr/>
@@ -10016,6 +10237,29 @@
     <w:pPr/>
     <w:rPr/>
   </w:style>
+  <w:style w:type="paragraph" w:styleId="TableContents">
+    <w:name w:val="Table Contents"/>
+    <w:basedOn w:val="Normal"/>
+    <w:qFormat/>
+    <w:pPr>
+      <w:widowControl w:val="false"/>
+      <w:suppressLineNumbers/>
+    </w:pPr>
+    <w:rPr/>
+  </w:style>
+  <w:style w:type="paragraph" w:styleId="TableHeading">
+    <w:name w:val="Table Heading"/>
+    <w:basedOn w:val="TableContents"/>
+    <w:qFormat/>
+    <w:pPr>
+      <w:suppressLineNumbers/>
+      <w:jc w:val="center"/>
+    </w:pPr>
+    <w:rPr>
+      <w:b/>
+      <w:bCs/>
+    </w:rPr>
+  </w:style>
   <w:style w:type="numbering" w:styleId="NoList" w:default="1">
     <w:name w:val="No List"/>
     <w:uiPriority w:val="99"/>

</xml_diff>